<commit_message>
envio de informação pdf finalizado
</commit_message>
<xml_diff>
--- a/src/templates/relatorio.docx
+++ b/src/templates/relatorio.docx
@@ -264,7 +264,41 @@
           <w:sz w:val="24"/>
           <w:szCs w:val="24"/>
         </w:rPr>
-        <w:t>A análise decorre de pedido de usucapião de imóvel que confronta com rodovia estadual, sendo necessária a verificação do respeito à faixa de domínio da via.</w:t>
+        <w:t xml:space="preserve">A análise decorre de pedido de </w:t>
+      </w:r>
+      <w:r>
+        <w:rPr>
+          <w:rFonts w:ascii="Tahoma" w:hAnsi="Tahoma" w:cs="Tahoma"/>
+          <w:sz w:val="24"/>
+          <w:szCs w:val="24"/>
+        </w:rPr>
+        <w:t>{</w:t>
+      </w:r>
+      <w:proofErr w:type="spellStart"/>
+      <w:r>
+        <w:rPr>
+          <w:rFonts w:ascii="Tahoma" w:hAnsi="Tahoma" w:cs="Tahoma"/>
+          <w:sz w:val="24"/>
+          <w:szCs w:val="24"/>
+        </w:rPr>
+        <w:t>tipoAnuencia</w:t>
+      </w:r>
+      <w:proofErr w:type="spellEnd"/>
+      <w:r>
+        <w:rPr>
+          <w:rFonts w:ascii="Tahoma" w:hAnsi="Tahoma" w:cs="Tahoma"/>
+          <w:sz w:val="24"/>
+          <w:szCs w:val="24"/>
+        </w:rPr>
+        <w:t>}</w:t>
+      </w:r>
+      <w:r>
+        <w:rPr>
+          <w:rFonts w:ascii="Tahoma" w:hAnsi="Tahoma" w:cs="Tahoma"/>
+          <w:sz w:val="24"/>
+          <w:szCs w:val="24"/>
+        </w:rPr>
+        <w:t xml:space="preserve"> de imóvel que confronta com rodovia estadual, sendo necessária a verificação do respeito à faixa de domínio da via.</w:t>
       </w:r>
     </w:p>
     <w:p>
@@ -300,7 +334,27 @@
           <w:sz w:val="24"/>
           <w:szCs w:val="24"/>
         </w:rPr>
-        <w:t>Identificação da Confrontação</w:t>
+        <w:t>Identific</w:t>
+      </w:r>
+      <w:r>
+        <w:rPr>
+          <w:rFonts w:ascii="Tahoma" w:hAnsi="Tahoma" w:cs="Tahoma"/>
+          <w:b/>
+          <w:bCs/>
+          <w:sz w:val="24"/>
+          <w:szCs w:val="24"/>
+        </w:rPr>
+        <w:t>a</w:t>
+      </w:r>
+      <w:r>
+        <w:rPr>
+          <w:rFonts w:ascii="Tahoma" w:hAnsi="Tahoma" w:cs="Tahoma"/>
+          <w:b/>
+          <w:bCs/>
+          <w:sz w:val="24"/>
+          <w:szCs w:val="24"/>
+        </w:rPr>
+        <w:t>ção da Confrontação</w:t>
       </w:r>
     </w:p>
     <w:p>
@@ -412,6 +466,30 @@
         </w:rPr>
         <w:t>Conforme o Decreto Estadual nº {</w:t>
       </w:r>
+      <w:r>
+        <w:rPr>
+          <w:rFonts w:ascii="Tahoma" w:hAnsi="Tahoma" w:cs="Tahoma"/>
+          <w:sz w:val="24"/>
+          <w:szCs w:val="24"/>
+        </w:rPr>
+        <w:t>decreto</w:t>
+      </w:r>
+      <w:r>
+        <w:rPr>
+          <w:rFonts w:ascii="Tahoma" w:hAnsi="Tahoma" w:cs="Tahoma"/>
+          <w:sz w:val="24"/>
+          <w:szCs w:val="24"/>
+        </w:rPr>
+        <w:t>}</w:t>
+      </w:r>
+      <w:r>
+        <w:rPr>
+          <w:rFonts w:ascii="Tahoma" w:hAnsi="Tahoma" w:cs="Tahoma"/>
+          <w:sz w:val="24"/>
+          <w:szCs w:val="24"/>
+        </w:rPr>
+        <w:t>/{</w:t>
+      </w:r>
       <w:proofErr w:type="spellStart"/>
       <w:r>
         <w:rPr>
@@ -419,7 +497,7 @@
           <w:sz w:val="24"/>
           <w:szCs w:val="24"/>
         </w:rPr>
-        <w:t>decretoSRE</w:t>
+        <w:t>anoSRE</w:t>
       </w:r>
       <w:proofErr w:type="spellEnd"/>
       <w:r>
@@ -428,7 +506,15 @@
           <w:sz w:val="24"/>
           <w:szCs w:val="24"/>
         </w:rPr>
-        <w:t>}, a faixa de domínio da rodovia possui largura total de {</w:t>
+        <w:t>}</w:t>
+      </w:r>
+      <w:r>
+        <w:rPr>
+          <w:rFonts w:ascii="Tahoma" w:hAnsi="Tahoma" w:cs="Tahoma"/>
+          <w:sz w:val="24"/>
+          <w:szCs w:val="24"/>
+        </w:rPr>
+        <w:t>, a faixa de domínio da rodovia possui largura total de {</w:t>
       </w:r>
       <w:proofErr w:type="spellStart"/>
       <w:r>
@@ -604,51 +690,6 @@
         </w:rPr>
         <w:t>}</w:t>
       </w:r>
-    </w:p>
-    <w:p>
-      <w:pPr>
-        <w:spacing w:line="360" w:lineRule="auto"/>
-        <w:contextualSpacing/>
-        <w:jc w:val="both"/>
-        <w:rPr>
-          <w:rFonts w:ascii="Tahoma" w:hAnsi="Tahoma" w:cs="Tahoma"/>
-          <w:sz w:val="24"/>
-          <w:szCs w:val="24"/>
-        </w:rPr>
-      </w:pPr>
-    </w:p>
-    <w:p>
-      <w:pPr>
-        <w:spacing w:line="360" w:lineRule="auto"/>
-        <w:contextualSpacing/>
-        <w:jc w:val="both"/>
-        <w:rPr>
-          <w:rFonts w:ascii="Tahoma" w:hAnsi="Tahoma" w:cs="Tahoma"/>
-          <w:sz w:val="24"/>
-          <w:szCs w:val="24"/>
-        </w:rPr>
-      </w:pPr>
-    </w:p>
-    <w:p>
-      <w:pPr>
-        <w:spacing w:after="0" w:line="360" w:lineRule="auto"/>
-        <w:contextualSpacing/>
-        <w:jc w:val="both"/>
-        <w:rPr>
-          <w:rFonts w:ascii="Tahoma" w:hAnsi="Tahoma" w:cs="Tahoma"/>
-          <w:sz w:val="24"/>
-          <w:szCs w:val="24"/>
-        </w:rPr>
-        <w:sectPr>
-          <w:headerReference w:type="default" r:id="rId8"/>
-          <w:footerReference w:type="default" r:id="rId9"/>
-          <w:type w:val="continuous"/>
-          <w:pgSz w:w="11906" w:h="16838"/>
-          <w:pgMar w:top="2693" w:right="1134" w:bottom="992" w:left="1134" w:header="708" w:footer="708" w:gutter="0"/>
-          <w:cols w:space="708"/>
-          <w:docGrid w:linePitch="360"/>
-        </w:sectPr>
-      </w:pPr>
     </w:p>
     <w:tbl>
       <w:tblPr>
@@ -695,7 +736,6 @@
               </w:rPr>
               <w:t>{#</w:t>
             </w:r>
-            <w:proofErr w:type="gramStart"/>
             <w:r>
               <w:rPr>
                 <w:rFonts w:ascii="Tahoma" w:hAnsi="Tahoma" w:cs="Tahoma"/>
@@ -710,16 +750,7 @@
                 <w:sz w:val="24"/>
                 <w:szCs w:val="24"/>
               </w:rPr>
-              <w:t>}{</w:t>
-            </w:r>
-            <w:proofErr w:type="gramEnd"/>
-            <w:r>
-              <w:rPr>
-                <w:rFonts w:ascii="Tahoma" w:hAnsi="Tahoma" w:cs="Tahoma"/>
-                <w:sz w:val="24"/>
-                <w:szCs w:val="24"/>
-              </w:rPr>
-              <w:t>%img1}</w:t>
+              <w:t>}{%img1}</w:t>
             </w:r>
           </w:p>
         </w:tc>
@@ -805,25 +836,7 @@
                 <w:sz w:val="24"/>
                 <w:szCs w:val="24"/>
               </w:rPr>
-              <w:t>{legenda</w:t>
-            </w:r>
-            <w:proofErr w:type="gramStart"/>
-            <w:r>
-              <w:rPr>
-                <w:rFonts w:ascii="Tahoma" w:hAnsi="Tahoma" w:cs="Tahoma"/>
-                <w:sz w:val="24"/>
-                <w:szCs w:val="24"/>
-              </w:rPr>
-              <w:t>2}{</w:t>
-            </w:r>
-            <w:proofErr w:type="gramEnd"/>
-            <w:r>
-              <w:rPr>
-                <w:rFonts w:ascii="Tahoma" w:hAnsi="Tahoma" w:cs="Tahoma"/>
-                <w:sz w:val="24"/>
-                <w:szCs w:val="24"/>
-              </w:rPr>
-              <w:t>/</w:t>
+              <w:t>{legenda2}{/</w:t>
             </w:r>
             <w:proofErr w:type="spellStart"/>
             <w:r>
@@ -858,6 +871,8 @@
           <w:szCs w:val="24"/>
         </w:rPr>
         <w:sectPr>
+          <w:headerReference w:type="default" r:id="rId8"/>
+          <w:footerReference w:type="default" r:id="rId9"/>
           <w:type w:val="continuous"/>
           <w:pgSz w:w="11906" w:h="16838"/>
           <w:pgMar w:top="2693" w:right="1134" w:bottom="992" w:left="1134" w:header="708" w:footer="708" w:gutter="0"/>
@@ -1028,21 +1043,6 @@
         </w:rPr>
         <w:t>}</w:t>
       </w:r>
-    </w:p>
-    <w:p>
-      <w:pPr>
-        <w:spacing w:after="0" w:line="240" w:lineRule="auto"/>
-        <w:jc w:val="center"/>
-        <w:rPr>
-          <w:rFonts w:ascii="Tahoma" w:eastAsia="Times New Roman" w:hAnsi="Tahoma" w:cs="Tahoma"/>
-          <w:i/>
-          <w:iCs/>
-          <w:color w:val="000000"/>
-          <w:sz w:val="18"/>
-          <w:szCs w:val="18"/>
-          <w:lang w:eastAsia="pt-BR"/>
-        </w:rPr>
-      </w:pPr>
     </w:p>
     <w:p>
       <w:pPr>
@@ -1111,7 +1111,6 @@
               </w:rPr>
               <w:t>{#</w:t>
             </w:r>
-            <w:proofErr w:type="gramStart"/>
             <w:r>
               <w:rPr>
                 <w:rFonts w:ascii="Tahoma" w:hAnsi="Tahoma" w:cs="Tahoma"/>
@@ -1126,16 +1125,7 @@
                 <w:sz w:val="24"/>
                 <w:szCs w:val="24"/>
               </w:rPr>
-              <w:t>}{</w:t>
-            </w:r>
-            <w:proofErr w:type="gramEnd"/>
-            <w:r>
-              <w:rPr>
-                <w:rFonts w:ascii="Tahoma" w:hAnsi="Tahoma" w:cs="Tahoma"/>
-                <w:sz w:val="24"/>
-                <w:szCs w:val="24"/>
-              </w:rPr>
-              <w:t>%img1}</w:t>
+              <w:t>}{%img1}</w:t>
             </w:r>
           </w:p>
         </w:tc>
@@ -1221,25 +1211,7 @@
                 <w:sz w:val="24"/>
                 <w:szCs w:val="24"/>
               </w:rPr>
-              <w:t>{legenda</w:t>
-            </w:r>
-            <w:proofErr w:type="gramStart"/>
-            <w:r>
-              <w:rPr>
-                <w:rFonts w:ascii="Tahoma" w:hAnsi="Tahoma" w:cs="Tahoma"/>
-                <w:sz w:val="24"/>
-                <w:szCs w:val="24"/>
-              </w:rPr>
-              <w:t>2}{</w:t>
-            </w:r>
-            <w:proofErr w:type="gramEnd"/>
-            <w:r>
-              <w:rPr>
-                <w:rFonts w:ascii="Tahoma" w:hAnsi="Tahoma" w:cs="Tahoma"/>
-                <w:sz w:val="24"/>
-                <w:szCs w:val="24"/>
-              </w:rPr>
-              <w:t>/</w:t>
+              <w:t>{legenda2}{/</w:t>
             </w:r>
             <w:proofErr w:type="spellStart"/>
             <w:r>
@@ -1338,18 +1310,6 @@
     </w:p>
     <w:p>
       <w:pPr>
-        <w:spacing w:after="0" w:line="360" w:lineRule="auto"/>
-        <w:contextualSpacing/>
-        <w:jc w:val="both"/>
-        <w:rPr>
-          <w:rFonts w:ascii="Tahoma" w:hAnsi="Tahoma" w:cs="Tahoma"/>
-          <w:sz w:val="24"/>
-          <w:szCs w:val="24"/>
-        </w:rPr>
-      </w:pPr>
-    </w:p>
-    <w:p>
-      <w:pPr>
         <w:spacing w:line="360" w:lineRule="auto"/>
         <w:contextualSpacing/>
         <w:jc w:val="both"/>
@@ -1389,20 +1349,6 @@
     <w:p>
       <w:pPr>
         <w:spacing w:after="0" w:line="360" w:lineRule="auto"/>
-        <w:ind w:firstLine="709"/>
-        <w:contextualSpacing/>
-        <w:jc w:val="both"/>
-        <w:rPr>
-          <w:rFonts w:ascii="Tahoma" w:hAnsi="Tahoma" w:cs="Tahoma"/>
-          <w:sz w:val="24"/>
-          <w:szCs w:val="24"/>
-        </w:rPr>
-      </w:pPr>
-    </w:p>
-    <w:p>
-      <w:pPr>
-        <w:spacing w:after="0" w:line="360" w:lineRule="auto"/>
-        <w:ind w:firstLine="709"/>
         <w:contextualSpacing/>
         <w:jc w:val="both"/>
         <w:rPr>

</xml_diff>